<commit_message>
fix: add birth details to order documents
</commit_message>
<xml_diff>
--- a/templates/DKP.docx
+++ b/templates/DKP.docx
@@ -111,25 +111,7 @@
         <w:spacing w:line="240" w:lineRule="auto"/>
       </w:pPr>
       <w:r>
-        <w:t xml:space="preserve">{{ФИО </w:t>
-      </w:r>
-      <w:r>
-        <w:t>п</w:t>
-      </w:r>
-      <w:r>
-        <w:t xml:space="preserve">родавец}} {{Паспорт </w:t>
-      </w:r>
-      <w:r>
-        <w:t>п</w:t>
-      </w:r>
-      <w:r>
-        <w:t xml:space="preserve">родавец}} {{Адрес </w:t>
-      </w:r>
-      <w:r>
-        <w:t>п</w:t>
-      </w:r>
-      <w:r>
-        <w:t>родавец}}</w:t>
+        <w:t>{{ФИО продавец}} {{Дата рождения продавец}} {{Паспорт продавец}} {{Адрес продавец}}</w:t>
       </w:r>
     </w:p>
     <w:p>
@@ -152,27 +134,7 @@
     </w:p>
     <w:p>
       <w:r>
-        <w:t>{{ФИО</w:t>
-      </w:r>
-      <w:proofErr w:type="gramStart"/>
-      <w:r>
-        <w:t xml:space="preserve">}} </w:t>
-      </w:r>
-      <w:r>
-        <w:t xml:space="preserve"> </w:t>
-      </w:r>
-      <w:r>
-        <w:t>{</w:t>
-      </w:r>
-      <w:proofErr w:type="gramEnd"/>
-      <w:r>
-        <w:t xml:space="preserve">{Паспорт}} </w:t>
-      </w:r>
-      <w:r>
-        <w:t xml:space="preserve"> </w:t>
-      </w:r>
-      <w:r>
-        <w:t>{{Адрес}}</w:t>
+        <w:t>{{ФИО}} {{Дата рождения}} {{Паспорт}} {{Адрес}}</w:t>
       </w:r>
     </w:p>
     <w:p>
@@ -1061,6 +1023,11 @@
           <w:szCs w:val="28"/>
         </w:rPr>
         <w:t>___            Покупатель_____________________</w:t>
+      </w:r>
+    </w:p>
+    <w:p>
+      <w:r>
+        <w:t>{{Подпись продавец}}                                      {{Подпись}}</w:t>
       </w:r>
     </w:p>
     <w:p>

</xml_diff>

<commit_message>
fix: fill vehicle document details in templates
</commit_message>
<xml_diff>
--- a/templates/DKP.docx
+++ b/templates/DKP.docx
@@ -629,81 +629,20 @@
       </w:r>
     </w:p>
     <w:p>
-      <w:pPr>
-        <w:spacing w:line="240" w:lineRule="auto"/>
-        <w:rPr>
-          <w:i/>
-          <w:sz w:val="24"/>
-          <w:szCs w:val="24"/>
-        </w:rPr>
-      </w:pPr>
-      <w:r>
-        <w:rPr>
-          <w:i/>
-          <w:sz w:val="24"/>
-          <w:szCs w:val="24"/>
-        </w:rPr>
-        <w:t>СТОИМОСТЬ ТС -</w:t>
-      </w:r>
-      <w:r>
-        <w:rPr>
-          <w:i/>
-          <w:sz w:val="24"/>
-          <w:szCs w:val="24"/>
-        </w:rPr>
-        <w:t xml:space="preserve"> </w:t>
-      </w:r>
-      <w:r>
-        <w:t xml:space="preserve">{{Сумма </w:t>
-      </w:r>
-      <w:r>
-        <w:t>ДКП</w:t>
-      </w:r>
-      <w:r>
-        <w:t>}}</w:t>
-      </w:r>
-      <w:r>
-        <w:rPr>
-          <w:i/>
-          <w:sz w:val="24"/>
-          <w:szCs w:val="24"/>
-        </w:rPr>
-        <w:t xml:space="preserve"> </w:t>
-      </w:r>
-      <w:r>
-        <w:rPr>
-          <w:i/>
-          <w:sz w:val="24"/>
-          <w:szCs w:val="24"/>
-        </w:rPr>
-        <w:t xml:space="preserve">РУБ </w:t>
-      </w:r>
-      <w:proofErr w:type="gramStart"/>
-      <w:r>
-        <w:rPr>
-          <w:i/>
-          <w:sz w:val="24"/>
-          <w:szCs w:val="24"/>
-        </w:rPr>
-        <w:t>(</w:t>
-      </w:r>
-      <w:r>
-        <w:rPr>
-          <w:i/>
-          <w:sz w:val="24"/>
-          <w:szCs w:val="24"/>
-        </w:rPr>
-        <w:t xml:space="preserve"> </w:t>
-      </w:r>
-      <w:r>
-        <w:rPr>
-          <w:i/>
-          <w:sz w:val="24"/>
-          <w:szCs w:val="24"/>
-        </w:rPr>
-        <w:t>)</w:t>
-      </w:r>
-      <w:proofErr w:type="gramEnd"/>
+      <w:r>
+        <w:t>СТОИМОСТЬ ТС - {{Сумма ДКП}} РУБ ({{Сумма ДКП прописью}})</w:t>
+      </w:r>
+    </w:p>
+    <w:p>
+      <w:pPr>
+        <w:spacing w:line="240" w:lineRule="auto"/>
+        <w:rPr>
+          <w:i/>
+          <w:sz w:val="24"/>
+          <w:szCs w:val="24"/>
+        </w:rPr>
+      </w:pPr>
+      <w:r/>
     </w:p>
     <w:p>
       <w:pPr>

</xml_diff>

<commit_message>
fix: stabilize contract document templates
</commit_message>
<xml_diff>
--- a/templates/DKP.docx
+++ b/templates/DKP.docx
@@ -82,7 +82,7 @@
     </w:p>
     <w:p>
       <w:pPr>
-        <w:spacing w:line="240" w:lineRule="auto"/>
+        <w:spacing w:line="240" w:lineRule="auto" w:after="20" w:before="0"/>
         <w:rPr>
           <w:b/>
           <w:sz w:val="32"/>
@@ -92,49 +92,74 @@
       <w:r>
         <w:rPr>
           <w:b/>
-          <w:sz w:val="32"/>
-          <w:szCs w:val="32"/>
         </w:rPr>
         <w:t>Продавец:</w:t>
       </w:r>
-      <w:r>
+      <w:r/>
+    </w:p>
+    <w:p>
+      <w:pPr>
+        <w:spacing w:line="240" w:lineRule="auto" w:after="20" w:before="0"/>
+      </w:pPr>
+      <w:r>
+        <w:t>ФИО: {{ФИО продавец}}, дата рождения: {{Дата рождения продавец}}</w:t>
+      </w:r>
+    </w:p>
+    <w:p>
+      <w:pPr>
+        <w:spacing w:after="20" w:before="0" w:line="240" w:lineRule="auto"/>
+      </w:pPr>
+      <w:r>
+        <w:t>Паспорт: {{Паспорт продавец}}</w:t>
+      </w:r>
+    </w:p>
+    <w:p>
+      <w:pPr>
+        <w:spacing w:after="20" w:before="0" w:line="240" w:lineRule="auto"/>
+      </w:pPr>
+      <w:r>
+        <w:t>Адрес регистрации: {{Адрес продавец}}</w:t>
+      </w:r>
+    </w:p>
+    <w:p>
+      <w:pPr>
+        <w:spacing w:line="240" w:lineRule="auto" w:after="20" w:before="0"/>
         <w:rPr>
           <w:b/>
           <w:sz w:val="32"/>
           <w:szCs w:val="32"/>
         </w:rPr>
-        <w:t xml:space="preserve"> </w:t>
-      </w:r>
-    </w:p>
-    <w:p>
-      <w:pPr>
-        <w:spacing w:line="240" w:lineRule="auto"/>
-      </w:pPr>
-      <w:r>
-        <w:t>{{ФИО продавец}} {{Дата рождения продавец}} {{Паспорт продавец}} {{Адрес продавец}}</w:t>
-      </w:r>
-    </w:p>
-    <w:p>
-      <w:pPr>
-        <w:spacing w:line="240" w:lineRule="auto"/>
+      </w:pPr>
+      <w:r>
         <w:rPr>
           <w:b/>
-          <w:sz w:val="32"/>
-          <w:szCs w:val="32"/>
-        </w:rPr>
-      </w:pPr>
-      <w:r>
-        <w:rPr>
-          <w:b/>
-          <w:sz w:val="32"/>
-          <w:szCs w:val="32"/>
         </w:rPr>
         <w:t>Покупатель:</w:t>
       </w:r>
-    </w:p>
-    <w:p>
-      <w:r>
-        <w:t>{{ФИО}} {{Дата рождения}} {{Паспорт}} {{Адрес}}</w:t>
+      <w:r/>
+    </w:p>
+    <w:p>
+      <w:pPr>
+        <w:spacing w:after="20" w:before="0" w:line="240" w:lineRule="auto"/>
+      </w:pPr>
+      <w:r>
+        <w:t>ФИО: {{ФИО}}, дата рождения: {{Дата рождения}}</w:t>
+      </w:r>
+    </w:p>
+    <w:p>
+      <w:pPr>
+        <w:spacing w:after="20" w:before="0" w:line="240" w:lineRule="auto"/>
+      </w:pPr>
+      <w:r>
+        <w:t>Паспорт: {{Паспорт}}</w:t>
+      </w:r>
+    </w:p>
+    <w:p>
+      <w:pPr>
+        <w:spacing w:after="20" w:before="0" w:line="240" w:lineRule="auto"/>
+      </w:pPr>
+      <w:r>
+        <w:t>Адрес регистрации: {{Адрес}}</w:t>
       </w:r>
     </w:p>
     <w:p>
@@ -933,52 +958,41 @@
     <w:p>
       <w:pPr>
         <w:spacing w:line="240" w:lineRule="auto"/>
+        <w:jc w:val="center"/>
         <w:rPr>
           <w:i/>
           <w:sz w:val="28"/>
           <w:szCs w:val="28"/>
         </w:rPr>
       </w:pPr>
-      <w:r>
-        <w:rPr>
-          <w:i/>
-          <w:sz w:val="28"/>
-          <w:szCs w:val="28"/>
-        </w:rPr>
-        <w:t>Продавец____________</w:t>
-      </w:r>
-      <w:r>
-        <w:rPr>
-          <w:i/>
-          <w:sz w:val="28"/>
-          <w:szCs w:val="28"/>
-        </w:rPr>
-        <w:t>____</w:t>
-      </w:r>
-      <w:r>
-        <w:rPr>
-          <w:i/>
-          <w:sz w:val="28"/>
-          <w:szCs w:val="28"/>
-        </w:rPr>
-        <w:t>___            Покупатель_____________________</w:t>
-      </w:r>
-    </w:p>
-    <w:p>
-      <w:r>
-        <w:t>{{Подпись продавец}}                                      {{Подпись}}</w:t>
-      </w:r>
-    </w:p>
-    <w:p>
-      <w:pPr>
-        <w:spacing w:line="240" w:lineRule="auto"/>
-        <w:jc w:val="center"/>
-        <w:rPr>
-          <w:i/>
-          <w:sz w:val="28"/>
-          <w:szCs w:val="28"/>
-        </w:rPr>
-      </w:pPr>
+    </w:p>
+    <w:p>
+      <w:pPr>
+        <w:tabs>
+          <w:tab w:pos="5328" w:val="left"/>
+        </w:tabs>
+        <w:spacing w:before="160" w:after="0"/>
+      </w:pPr>
+      <w:r>
+        <w:rPr>
+          <w:sz w:val="22"/>
+        </w:rPr>
+        <w:t>Продавец ___________________            Покупатель ___________________</w:t>
+      </w:r>
+    </w:p>
+    <w:p>
+      <w:pPr>
+        <w:tabs>
+          <w:tab w:pos="5328" w:val="left"/>
+        </w:tabs>
+        <w:spacing w:before="0" w:after="0"/>
+      </w:pPr>
+      <w:r>
+        <w:rPr>
+          <w:sz w:val="22"/>
+        </w:rPr>
+        <w:t>{{Подпись продавец}}                                           {{Подпись}}</w:t>
+      </w:r>
     </w:p>
     <w:sectPr>
       <w:headerReference w:type="even" r:id="rId7"/>

</xml_diff>

<commit_message>
fix: update document flow and duty withdrawals
</commit_message>
<xml_diff>
--- a/templates/DKP.docx
+++ b/templates/DKP.docx
@@ -1,6 +1,6 @@
 
 <file path=word/document.xml><?xml version="1.0" encoding="utf-8"?>
-<w:document xmlns:wpc="http://schemas.microsoft.com/office/word/2010/wordprocessingCanvas" xmlns:cx="http://schemas.microsoft.com/office/drawing/2014/chartex" xmlns:cx1="http://schemas.microsoft.com/office/drawing/2015/9/8/chartex" xmlns:cx2="http://schemas.microsoft.com/office/drawing/2015/10/21/chartex" xmlns:cx3="http://schemas.microsoft.com/office/drawing/2016/5/9/chartex" xmlns:cx4="http://schemas.microsoft.com/office/drawing/2016/5/10/chartex" xmlns:cx5="http://schemas.microsoft.com/office/drawing/2016/5/11/chartex" xmlns:cx6="http://schemas.microsoft.com/office/drawing/2016/5/12/chartex" xmlns:cx7="http://schemas.microsoft.com/office/drawing/2016/5/13/chartex" xmlns:cx8="http://schemas.microsoft.com/office/drawing/2016/5/14/chartex" xmlns:mc="http://schemas.openxmlformats.org/markup-compatibility/2006" xmlns:aink="http://schemas.microsoft.com/office/drawing/2016/ink" xmlns:am3d="http://schemas.microsoft.com/office/drawing/2017/model3d" xmlns:o="urn:schemas-microsoft-com:office:office" xmlns:r="http://schemas.openxmlformats.org/officeDocument/2006/relationships" xmlns:m="http://schemas.openxmlformats.org/officeDocument/2006/math" xmlns:v="urn:schemas-microsoft-com:vml" xmlns:wp14="http://schemas.microsoft.com/office/word/2010/wordprocessingDrawing" xmlns:wp="http://schemas.openxmlformats.org/drawingml/2006/wordprocessingDrawing" xmlns:w10="urn:schemas-microsoft-com:office:word" xmlns:w="http://schemas.openxmlformats.org/wordprocessingml/2006/main" xmlns:w14="http://schemas.microsoft.com/office/word/2010/wordml" xmlns:w15="http://schemas.microsoft.com/office/word/2012/wordml" xmlns:w16cex="http://schemas.microsoft.com/office/word/2018/wordml/cex" xmlns:w16cid="http://schemas.microsoft.com/office/word/2016/wordml/cid" xmlns:w16="http://schemas.microsoft.com/office/word/2018/wordml" xmlns:w16sdtdh="http://schemas.microsoft.com/office/word/2020/wordml/sdtdatahash" xmlns:w16se="http://schemas.microsoft.com/office/word/2015/wordml/symex" xmlns:wpg="http://schemas.microsoft.com/office/word/2010/wordprocessingGroup" xmlns:wpi="http://schemas.microsoft.com/office/word/2010/wordprocessingInk" xmlns:wne="http://schemas.microsoft.com/office/word/2006/wordml" xmlns:wps="http://schemas.microsoft.com/office/word/2010/wordprocessingShape" mc:Ignorable="w14 w15 w16se w16cid w16 w16cex w16sdtdh wp14">
+<w:document xmlns:wpc="http://schemas.microsoft.com/office/word/2010/wordprocessingCanvas" xmlns:cx="http://schemas.microsoft.com/office/drawing/2014/chartex" xmlns:cx1="http://schemas.microsoft.com/office/drawing/2015/9/8/chartex" xmlns:cx2="http://schemas.microsoft.com/office/drawing/2015/10/21/chartex" xmlns:cx3="http://schemas.microsoft.com/office/drawing/2016/5/9/chartex" xmlns:cx4="http://schemas.microsoft.com/office/drawing/2016/5/10/chartex" xmlns:cx5="http://schemas.microsoft.com/office/drawing/2016/5/11/chartex" xmlns:cx6="http://schemas.microsoft.com/office/drawing/2016/5/12/chartex" xmlns:cx7="http://schemas.microsoft.com/office/drawing/2016/5/13/chartex" xmlns:cx8="http://schemas.microsoft.com/office/drawing/2016/5/14/chartex" xmlns:mc="http://schemas.openxmlformats.org/markup-compatibility/2006" xmlns:aink="http://schemas.microsoft.com/office/drawing/2016/ink" xmlns:am3d="http://schemas.microsoft.com/office/drawing/2017/model3d" xmlns:o="urn:schemas-microsoft-com:office:office" xmlns:oel="http://schemas.microsoft.com/office/2019/extlst" xmlns:r="http://schemas.openxmlformats.org/officeDocument/2006/relationships" xmlns:m="http://schemas.openxmlformats.org/officeDocument/2006/math" xmlns:v="urn:schemas-microsoft-com:vml" xmlns:wp14="http://schemas.microsoft.com/office/word/2010/wordprocessingDrawing" xmlns:wp="http://schemas.openxmlformats.org/drawingml/2006/wordprocessingDrawing" xmlns:w10="urn:schemas-microsoft-com:office:word" xmlns:w="http://schemas.openxmlformats.org/wordprocessingml/2006/main" xmlns:w14="http://schemas.microsoft.com/office/word/2010/wordml" xmlns:w15="http://schemas.microsoft.com/office/word/2012/wordml" xmlns:w16cex="http://schemas.microsoft.com/office/word/2018/wordml/cex" xmlns:w16cid="http://schemas.microsoft.com/office/word/2016/wordml/cid" xmlns:w16="http://schemas.microsoft.com/office/word/2018/wordml" xmlns:w16du="http://schemas.microsoft.com/office/word/2023/wordml/word16du" xmlns:w16sdtdh="http://schemas.microsoft.com/office/word/2020/wordml/sdtdatahash" xmlns:w16sdtfl="http://schemas.microsoft.com/office/word/2024/wordml/sdtformatlock" xmlns:w16se="http://schemas.microsoft.com/office/word/2015/wordml/symex" xmlns:wpg="http://schemas.microsoft.com/office/word/2010/wordprocessingGroup" xmlns:wpi="http://schemas.microsoft.com/office/word/2010/wordprocessingInk" xmlns:wne="http://schemas.microsoft.com/office/word/2006/wordml" xmlns:wps="http://schemas.microsoft.com/office/word/2010/wordprocessingShape" mc:Ignorable="w14 w15 w16se w16cid w16 w16cex w16sdtdh w16sdtfl w16du wp14">
   <w:body>
     <w:p>
       <w:pPr>
@@ -82,7 +82,7 @@
     </w:p>
     <w:p>
       <w:pPr>
-        <w:spacing w:line="240" w:lineRule="auto" w:after="20" w:before="0"/>
+        <w:spacing w:after="20" w:line="240" w:lineRule="auto"/>
         <w:rPr>
           <w:b/>
           <w:sz w:val="32"/>
@@ -95,11 +95,10 @@
         </w:rPr>
         <w:t>Продавец:</w:t>
       </w:r>
-      <w:r/>
-    </w:p>
-    <w:p>
-      <w:pPr>
-        <w:spacing w:line="240" w:lineRule="auto" w:after="20" w:before="0"/>
+    </w:p>
+    <w:p>
+      <w:pPr>
+        <w:spacing w:after="20" w:line="240" w:lineRule="auto"/>
       </w:pPr>
       <w:r>
         <w:t>ФИО: {{ФИО продавец}}, дата рождения: {{Дата рождения продавец}}</w:t>
@@ -107,7 +106,7 @@
     </w:p>
     <w:p>
       <w:pPr>
-        <w:spacing w:after="20" w:before="0" w:line="240" w:lineRule="auto"/>
+        <w:spacing w:after="20" w:line="240" w:lineRule="auto"/>
       </w:pPr>
       <w:r>
         <w:t>Паспорт: {{Паспорт продавец}}</w:t>
@@ -115,7 +114,7 @@
     </w:p>
     <w:p>
       <w:pPr>
-        <w:spacing w:after="20" w:before="0" w:line="240" w:lineRule="auto"/>
+        <w:spacing w:after="20" w:line="240" w:lineRule="auto"/>
       </w:pPr>
       <w:r>
         <w:t>Адрес регистрации: {{Адрес продавец}}</w:t>
@@ -123,7 +122,7 @@
     </w:p>
     <w:p>
       <w:pPr>
-        <w:spacing w:line="240" w:lineRule="auto" w:after="20" w:before="0"/>
+        <w:spacing w:after="20" w:line="240" w:lineRule="auto"/>
         <w:rPr>
           <w:b/>
           <w:sz w:val="32"/>
@@ -136,11 +135,10 @@
         </w:rPr>
         <w:t>Покупатель:</w:t>
       </w:r>
-      <w:r/>
-    </w:p>
-    <w:p>
-      <w:pPr>
-        <w:spacing w:after="20" w:before="0" w:line="240" w:lineRule="auto"/>
+    </w:p>
+    <w:p>
+      <w:pPr>
+        <w:spacing w:after="20" w:line="240" w:lineRule="auto"/>
       </w:pPr>
       <w:r>
         <w:t>ФИО: {{ФИО}}, дата рождения: {{Дата рождения}}</w:t>
@@ -148,7 +146,7 @@
     </w:p>
     <w:p>
       <w:pPr>
-        <w:spacing w:after="20" w:before="0" w:line="240" w:lineRule="auto"/>
+        <w:spacing w:after="20" w:line="240" w:lineRule="auto"/>
       </w:pPr>
       <w:r>
         <w:t>Паспорт: {{Паспорт}}</w:t>
@@ -156,7 +154,7 @@
     </w:p>
     <w:p>
       <w:pPr>
-        <w:spacing w:after="20" w:before="0" w:line="240" w:lineRule="auto"/>
+        <w:spacing w:after="20" w:line="240" w:lineRule="auto"/>
       </w:pPr>
       <w:r>
         <w:t>Адрес регистрации: {{Адрес}}</w:t>
@@ -283,7 +281,15 @@
           <w:sz w:val="24"/>
           <w:szCs w:val="24"/>
         </w:rPr>
-        <w:t>ОГО</w:t>
+        <w:t>О</w:t>
+      </w:r>
+      <w:r>
+        <w:rPr>
+          <w:i/>
+          <w:sz w:val="24"/>
+          <w:szCs w:val="24"/>
+        </w:rPr>
+        <w:t>Е</w:t>
       </w:r>
       <w:r>
         <w:rPr>
@@ -308,7 +314,7 @@
           <w:sz w:val="24"/>
           <w:szCs w:val="24"/>
         </w:rPr>
-        <w:t>А</w:t>
+        <w:t>О</w:t>
       </w:r>
       <w:r>
         <w:rPr>
@@ -663,11 +669,50 @@
         <w:spacing w:line="240" w:lineRule="auto"/>
         <w:rPr>
           <w:i/>
-          <w:sz w:val="24"/>
-          <w:szCs w:val="24"/>
-        </w:rPr>
-      </w:pPr>
-      <w:r/>
+          <w:sz w:val="20"/>
+          <w:szCs w:val="20"/>
+        </w:rPr>
+      </w:pPr>
+      <w:r>
+        <w:rPr>
+          <w:i/>
+          <w:sz w:val="20"/>
+          <w:szCs w:val="20"/>
+        </w:rPr>
+        <w:t>2.</w:t>
+      </w:r>
+      <w:r>
+        <w:rPr>
+          <w:rStyle w:val="ab"/>
+          <w:sz w:val="20"/>
+          <w:szCs w:val="20"/>
+        </w:rPr>
+        <w:t>ПРОДАВЕЦ</w:t>
+      </w:r>
+      <w:r>
+        <w:rPr>
+          <w:i/>
+          <w:sz w:val="20"/>
+          <w:szCs w:val="20"/>
+        </w:rPr>
+        <w:t xml:space="preserve"> подтверждает,</w:t>
+      </w:r>
+      <w:r>
+        <w:rPr>
+          <w:i/>
+          <w:sz w:val="20"/>
+          <w:szCs w:val="20"/>
+        </w:rPr>
+        <w:t xml:space="preserve"> что ТС не заложено, не </w:t>
+      </w:r>
+      <w:r>
+        <w:rPr>
+          <w:i/>
+          <w:sz w:val="20"/>
+          <w:szCs w:val="20"/>
+        </w:rPr>
+        <w:t>арестовано, не находится под обременением третьих лиц.</w:t>
+      </w:r>
     </w:p>
     <w:p>
       <w:pPr>
@@ -684,39 +729,89 @@
           <w:sz w:val="20"/>
           <w:szCs w:val="20"/>
         </w:rPr>
-        <w:t>2.</w:t>
-      </w:r>
-      <w:r>
-        <w:rPr>
-          <w:rStyle w:val="ab"/>
-          <w:sz w:val="20"/>
-          <w:szCs w:val="20"/>
-        </w:rPr>
-        <w:t>ПРОДАВЕЦ</w:t>
-      </w:r>
-      <w:r>
-        <w:rPr>
-          <w:i/>
-          <w:sz w:val="20"/>
-          <w:szCs w:val="20"/>
-        </w:rPr>
-        <w:t xml:space="preserve"> подтверждает,</w:t>
-      </w:r>
-      <w:r>
-        <w:rPr>
-          <w:i/>
-          <w:sz w:val="20"/>
-          <w:szCs w:val="20"/>
-        </w:rPr>
-        <w:t xml:space="preserve"> что ТС не заложено, не </w:t>
-      </w:r>
-      <w:r>
-        <w:rPr>
-          <w:i/>
-          <w:sz w:val="20"/>
-          <w:szCs w:val="20"/>
-        </w:rPr>
-        <w:t>арестовано, не находится под обременением третьих лиц.</w:t>
+        <w:t>3.</w:t>
+      </w:r>
+      <w:r>
+        <w:rPr>
+          <w:b/>
+          <w:i/>
+          <w:sz w:val="20"/>
+          <w:szCs w:val="20"/>
+        </w:rPr>
+        <w:t xml:space="preserve">Продавец ПЕРЕДАЕТ </w:t>
+      </w:r>
+      <w:r>
+        <w:rPr>
+          <w:i/>
+          <w:sz w:val="20"/>
+          <w:szCs w:val="20"/>
+        </w:rPr>
+        <w:t xml:space="preserve">вышеуказанное </w:t>
+      </w:r>
+      <w:r>
+        <w:rPr>
+          <w:b/>
+          <w:i/>
+          <w:sz w:val="20"/>
+          <w:szCs w:val="20"/>
+        </w:rPr>
+        <w:t>ТС</w:t>
+      </w:r>
+      <w:r>
+        <w:rPr>
+          <w:i/>
+          <w:sz w:val="20"/>
+          <w:szCs w:val="20"/>
+        </w:rPr>
+        <w:t xml:space="preserve"> покупателю </w:t>
+      </w:r>
+      <w:r>
+        <w:rPr>
+          <w:i/>
+          <w:sz w:val="20"/>
+          <w:szCs w:val="20"/>
+        </w:rPr>
+        <w:t>и получает</w:t>
+      </w:r>
+      <w:r>
+        <w:rPr>
+          <w:i/>
+          <w:sz w:val="20"/>
+          <w:szCs w:val="20"/>
+        </w:rPr>
+        <w:t xml:space="preserve"> полную </w:t>
+      </w:r>
+      <w:r>
+        <w:rPr>
+          <w:i/>
+          <w:sz w:val="20"/>
+          <w:szCs w:val="20"/>
+        </w:rPr>
+        <w:t xml:space="preserve">вышеуказанную </w:t>
+      </w:r>
+      <w:r>
+        <w:rPr>
+          <w:i/>
+          <w:sz w:val="20"/>
+          <w:szCs w:val="20"/>
+        </w:rPr>
+        <w:t>стоимость</w:t>
+      </w:r>
+      <w:r>
+        <w:rPr>
+          <w:i/>
+          <w:sz w:val="20"/>
+          <w:szCs w:val="20"/>
+        </w:rPr>
+        <w:t xml:space="preserve"> </w:t>
+      </w:r>
+      <w:r>
+        <w:rPr>
+          <w:i/>
+          <w:sz w:val="20"/>
+          <w:szCs w:val="20"/>
+        </w:rPr>
+        <w:t>ТС.</w:t>
       </w:r>
     </w:p>
     <w:p>
@@ -734,197 +829,7 @@
           <w:sz w:val="20"/>
           <w:szCs w:val="20"/>
         </w:rPr>
-        <w:t>3.</w:t>
-      </w:r>
-      <w:r>
-        <w:rPr>
-          <w:b/>
-          <w:i/>
-          <w:sz w:val="20"/>
-          <w:szCs w:val="20"/>
-        </w:rPr>
-        <w:t xml:space="preserve">Продавец ПЕРЕДАЕТ </w:t>
-      </w:r>
-      <w:r>
-        <w:rPr>
-          <w:i/>
-          <w:sz w:val="20"/>
-          <w:szCs w:val="20"/>
-        </w:rPr>
-        <w:t xml:space="preserve">вышеуказанное </w:t>
-      </w:r>
-      <w:r>
-        <w:rPr>
-          <w:b/>
-          <w:i/>
-          <w:sz w:val="20"/>
-          <w:szCs w:val="20"/>
-        </w:rPr>
-        <w:t>ТС</w:t>
-      </w:r>
-      <w:r>
-        <w:rPr>
-          <w:i/>
-          <w:sz w:val="20"/>
-          <w:szCs w:val="20"/>
-        </w:rPr>
-        <w:t xml:space="preserve"> покупателю </w:t>
-      </w:r>
-      <w:r>
-        <w:rPr>
-          <w:i/>
-          <w:sz w:val="20"/>
-          <w:szCs w:val="20"/>
-        </w:rPr>
-        <w:t>и получает</w:t>
-      </w:r>
-      <w:r>
-        <w:rPr>
-          <w:i/>
-          <w:sz w:val="20"/>
-          <w:szCs w:val="20"/>
-        </w:rPr>
-        <w:t xml:space="preserve"> полную </w:t>
-      </w:r>
-      <w:r>
-        <w:rPr>
-          <w:i/>
-          <w:sz w:val="20"/>
-          <w:szCs w:val="20"/>
-        </w:rPr>
-        <w:t xml:space="preserve">вышеуказанную </w:t>
-      </w:r>
-      <w:r>
-        <w:rPr>
-          <w:i/>
-          <w:sz w:val="20"/>
-          <w:szCs w:val="20"/>
-        </w:rPr>
-        <w:t>стоимость</w:t>
-      </w:r>
-      <w:r>
-        <w:rPr>
-          <w:i/>
-          <w:sz w:val="20"/>
-          <w:szCs w:val="20"/>
-        </w:rPr>
-        <w:t xml:space="preserve"> </w:t>
-      </w:r>
-      <w:r>
-        <w:rPr>
-          <w:i/>
-          <w:sz w:val="20"/>
-          <w:szCs w:val="20"/>
-        </w:rPr>
-        <w:t>ТС.</w:t>
-      </w:r>
-    </w:p>
-    <w:p>
-      <w:pPr>
-        <w:spacing w:line="240" w:lineRule="auto"/>
-        <w:rPr>
-          <w:i/>
-          <w:sz w:val="20"/>
-          <w:szCs w:val="20"/>
-        </w:rPr>
-      </w:pPr>
-      <w:r>
-        <w:rPr>
-          <w:i/>
-          <w:sz w:val="20"/>
-          <w:szCs w:val="20"/>
-        </w:rPr>
-        <w:t>4.</w:t>
-      </w:r>
-      <w:r>
-        <w:rPr>
-          <w:b/>
-          <w:i/>
-          <w:sz w:val="20"/>
-          <w:szCs w:val="20"/>
-        </w:rPr>
-        <w:t>Покупатель,</w:t>
-      </w:r>
-      <w:r>
-        <w:rPr>
-          <w:i/>
-          <w:sz w:val="20"/>
-          <w:szCs w:val="20"/>
-        </w:rPr>
-        <w:t xml:space="preserve"> сверив номера агрегатов, удовлетворённый внешним видом </w:t>
-      </w:r>
-      <w:r>
-        <w:rPr>
-          <w:i/>
-          <w:sz w:val="20"/>
-          <w:szCs w:val="20"/>
-        </w:rPr>
-        <w:t xml:space="preserve">данного </w:t>
-      </w:r>
-      <w:r>
-        <w:rPr>
-          <w:i/>
-          <w:sz w:val="20"/>
-          <w:szCs w:val="20"/>
-        </w:rPr>
-        <w:t>ТС, и осмотрев ТС во всех ракурсах</w:t>
-      </w:r>
-      <w:r>
-        <w:rPr>
-          <w:i/>
-          <w:sz w:val="20"/>
-          <w:szCs w:val="20"/>
-        </w:rPr>
-        <w:t xml:space="preserve">, </w:t>
-      </w:r>
-      <w:r>
-        <w:rPr>
-          <w:b/>
-          <w:i/>
-          <w:sz w:val="20"/>
-          <w:szCs w:val="20"/>
-        </w:rPr>
-        <w:t>ПРИНИМАЕТ ТС</w:t>
-      </w:r>
-      <w:r>
-        <w:rPr>
-          <w:i/>
-          <w:sz w:val="20"/>
-          <w:szCs w:val="20"/>
-        </w:rPr>
-        <w:t xml:space="preserve"> и предает</w:t>
-      </w:r>
-      <w:r>
-        <w:rPr>
-          <w:i/>
-          <w:sz w:val="20"/>
-          <w:szCs w:val="20"/>
-        </w:rPr>
-        <w:t xml:space="preserve"> покупателю полную</w:t>
-      </w:r>
-      <w:r>
-        <w:rPr>
-          <w:i/>
-          <w:sz w:val="20"/>
-          <w:szCs w:val="20"/>
-        </w:rPr>
-        <w:t xml:space="preserve"> вышеуказанную стоимость</w:t>
-      </w:r>
-      <w:r>
-        <w:rPr>
-          <w:i/>
-          <w:sz w:val="20"/>
-          <w:szCs w:val="20"/>
-        </w:rPr>
-        <w:t xml:space="preserve"> </w:t>
-      </w:r>
-      <w:r>
-        <w:rPr>
-          <w:i/>
-          <w:sz w:val="20"/>
-          <w:szCs w:val="20"/>
-        </w:rPr>
-        <w:t>ТС</w:t>
+        <w:t>4.Покупатель, сверив номера агрегатов, удовлетворённый внешним видом данного ТС, и осмотрев ТС во всех ракурсах, ПРИНИМАЕТ ТС и передает продавцу полную вышеуказанную стоимость ТС</w:t>
       </w:r>
     </w:p>
     <w:p>
@@ -969,28 +874,22 @@
     <w:p>
       <w:pPr>
         <w:tabs>
-          <w:tab w:pos="5328" w:val="left"/>
+          <w:tab w:val="left" w:pos="5328"/>
         </w:tabs>
         <w:spacing w:before="160" w:after="0"/>
       </w:pPr>
       <w:r>
-        <w:rPr>
-          <w:sz w:val="22"/>
-        </w:rPr>
         <w:t>Продавец ___________________            Покупатель ___________________</w:t>
       </w:r>
     </w:p>
     <w:p>
       <w:pPr>
         <w:tabs>
-          <w:tab w:pos="5328" w:val="left"/>
+          <w:tab w:val="left" w:pos="5328"/>
         </w:tabs>
-        <w:spacing w:before="0" w:after="0"/>
-      </w:pPr>
-      <w:r>
-        <w:rPr>
-          <w:sz w:val="22"/>
-        </w:rPr>
+        <w:spacing w:after="0"/>
+      </w:pPr>
+      <w:r>
         <w:t>{{Подпись продавец}}                                           {{Подпись}}</w:t>
       </w:r>
     </w:p>
@@ -1013,7 +912,7 @@
 </file>
 
 <file path=word/endnotes.xml><?xml version="1.0" encoding="utf-8"?>
-<w:endnotes xmlns:wpc="http://schemas.microsoft.com/office/word/2010/wordprocessingCanvas" xmlns:cx="http://schemas.microsoft.com/office/drawing/2014/chartex" xmlns:cx1="http://schemas.microsoft.com/office/drawing/2015/9/8/chartex" xmlns:cx2="http://schemas.microsoft.com/office/drawing/2015/10/21/chartex" xmlns:cx3="http://schemas.microsoft.com/office/drawing/2016/5/9/chartex" xmlns:cx4="http://schemas.microsoft.com/office/drawing/2016/5/10/chartex" xmlns:cx5="http://schemas.microsoft.com/office/drawing/2016/5/11/chartex" xmlns:cx6="http://schemas.microsoft.com/office/drawing/2016/5/12/chartex" xmlns:cx7="http://schemas.microsoft.com/office/drawing/2016/5/13/chartex" xmlns:cx8="http://schemas.microsoft.com/office/drawing/2016/5/14/chartex" xmlns:mc="http://schemas.openxmlformats.org/markup-compatibility/2006" xmlns:aink="http://schemas.microsoft.com/office/drawing/2016/ink" xmlns:am3d="http://schemas.microsoft.com/office/drawing/2017/model3d" xmlns:o="urn:schemas-microsoft-com:office:office" xmlns:r="http://schemas.openxmlformats.org/officeDocument/2006/relationships" xmlns:m="http://schemas.openxmlformats.org/officeDocument/2006/math" xmlns:v="urn:schemas-microsoft-com:vml" xmlns:wp14="http://schemas.microsoft.com/office/word/2010/wordprocessingDrawing" xmlns:wp="http://schemas.openxmlformats.org/drawingml/2006/wordprocessingDrawing" xmlns:w10="urn:schemas-microsoft-com:office:word" xmlns:w="http://schemas.openxmlformats.org/wordprocessingml/2006/main" xmlns:w14="http://schemas.microsoft.com/office/word/2010/wordml" xmlns:w15="http://schemas.microsoft.com/office/word/2012/wordml" xmlns:w16cex="http://schemas.microsoft.com/office/word/2018/wordml/cex" xmlns:w16cid="http://schemas.microsoft.com/office/word/2016/wordml/cid" xmlns:w16="http://schemas.microsoft.com/office/word/2018/wordml" xmlns:w16sdtdh="http://schemas.microsoft.com/office/word/2020/wordml/sdtdatahash" xmlns:w16se="http://schemas.microsoft.com/office/word/2015/wordml/symex" xmlns:wpg="http://schemas.microsoft.com/office/word/2010/wordprocessingGroup" xmlns:wpi="http://schemas.microsoft.com/office/word/2010/wordprocessingInk" xmlns:wne="http://schemas.microsoft.com/office/word/2006/wordml" xmlns:wps="http://schemas.microsoft.com/office/word/2010/wordprocessingShape" mc:Ignorable="w14 w15 w16se w16cid w16 w16cex w16sdtdh wp14">
+<w:endnotes xmlns:wpc="http://schemas.microsoft.com/office/word/2010/wordprocessingCanvas" xmlns:cx="http://schemas.microsoft.com/office/drawing/2014/chartex" xmlns:cx1="http://schemas.microsoft.com/office/drawing/2015/9/8/chartex" xmlns:cx2="http://schemas.microsoft.com/office/drawing/2015/10/21/chartex" xmlns:cx3="http://schemas.microsoft.com/office/drawing/2016/5/9/chartex" xmlns:cx4="http://schemas.microsoft.com/office/drawing/2016/5/10/chartex" xmlns:cx5="http://schemas.microsoft.com/office/drawing/2016/5/11/chartex" xmlns:cx6="http://schemas.microsoft.com/office/drawing/2016/5/12/chartex" xmlns:cx7="http://schemas.microsoft.com/office/drawing/2016/5/13/chartex" xmlns:cx8="http://schemas.microsoft.com/office/drawing/2016/5/14/chartex" xmlns:mc="http://schemas.openxmlformats.org/markup-compatibility/2006" xmlns:aink="http://schemas.microsoft.com/office/drawing/2016/ink" xmlns:am3d="http://schemas.microsoft.com/office/drawing/2017/model3d" xmlns:o="urn:schemas-microsoft-com:office:office" xmlns:oel="http://schemas.microsoft.com/office/2019/extlst" xmlns:r="http://schemas.openxmlformats.org/officeDocument/2006/relationships" xmlns:m="http://schemas.openxmlformats.org/officeDocument/2006/math" xmlns:v="urn:schemas-microsoft-com:vml" xmlns:wp14="http://schemas.microsoft.com/office/word/2010/wordprocessingDrawing" xmlns:wp="http://schemas.openxmlformats.org/drawingml/2006/wordprocessingDrawing" xmlns:w10="urn:schemas-microsoft-com:office:word" xmlns:w="http://schemas.openxmlformats.org/wordprocessingml/2006/main" xmlns:w14="http://schemas.microsoft.com/office/word/2010/wordml" xmlns:w15="http://schemas.microsoft.com/office/word/2012/wordml" xmlns:w16cex="http://schemas.microsoft.com/office/word/2018/wordml/cex" xmlns:w16cid="http://schemas.microsoft.com/office/word/2016/wordml/cid" xmlns:w16="http://schemas.microsoft.com/office/word/2018/wordml" xmlns:w16du="http://schemas.microsoft.com/office/word/2023/wordml/word16du" xmlns:w16sdtdh="http://schemas.microsoft.com/office/word/2020/wordml/sdtdatahash" xmlns:w16sdtfl="http://schemas.microsoft.com/office/word/2024/wordml/sdtformatlock" xmlns:w16se="http://schemas.microsoft.com/office/word/2015/wordml/symex" xmlns:wpg="http://schemas.microsoft.com/office/word/2010/wordprocessingGroup" xmlns:wpi="http://schemas.microsoft.com/office/word/2010/wordprocessingInk" xmlns:wne="http://schemas.microsoft.com/office/word/2006/wordml" xmlns:wps="http://schemas.microsoft.com/office/word/2010/wordprocessingShape" mc:Ignorable="w14 w15 w16se w16cid w16 w16cex w16sdtdh w16sdtfl w16du wp14">
   <w:endnote w:type="separator" w:id="-1">
     <w:p>
       <w:pPr>
@@ -1038,7 +937,7 @@
 </file>
 
 <file path=word/footnotes.xml><?xml version="1.0" encoding="utf-8"?>
-<w:footnotes xmlns:wpc="http://schemas.microsoft.com/office/word/2010/wordprocessingCanvas" xmlns:cx="http://schemas.microsoft.com/office/drawing/2014/chartex" xmlns:cx1="http://schemas.microsoft.com/office/drawing/2015/9/8/chartex" xmlns:cx2="http://schemas.microsoft.com/office/drawing/2015/10/21/chartex" xmlns:cx3="http://schemas.microsoft.com/office/drawing/2016/5/9/chartex" xmlns:cx4="http://schemas.microsoft.com/office/drawing/2016/5/10/chartex" xmlns:cx5="http://schemas.microsoft.com/office/drawing/2016/5/11/chartex" xmlns:cx6="http://schemas.microsoft.com/office/drawing/2016/5/12/chartex" xmlns:cx7="http://schemas.microsoft.com/office/drawing/2016/5/13/chartex" xmlns:cx8="http://schemas.microsoft.com/office/drawing/2016/5/14/chartex" xmlns:mc="http://schemas.openxmlformats.org/markup-compatibility/2006" xmlns:aink="http://schemas.microsoft.com/office/drawing/2016/ink" xmlns:am3d="http://schemas.microsoft.com/office/drawing/2017/model3d" xmlns:o="urn:schemas-microsoft-com:office:office" xmlns:r="http://schemas.openxmlformats.org/officeDocument/2006/relationships" xmlns:m="http://schemas.openxmlformats.org/officeDocument/2006/math" xmlns:v="urn:schemas-microsoft-com:vml" xmlns:wp14="http://schemas.microsoft.com/office/word/2010/wordprocessingDrawing" xmlns:wp="http://schemas.openxmlformats.org/drawingml/2006/wordprocessingDrawing" xmlns:w10="urn:schemas-microsoft-com:office:word" xmlns:w="http://schemas.openxmlformats.org/wordprocessingml/2006/main" xmlns:w14="http://schemas.microsoft.com/office/word/2010/wordml" xmlns:w15="http://schemas.microsoft.com/office/word/2012/wordml" xmlns:w16cex="http://schemas.microsoft.com/office/word/2018/wordml/cex" xmlns:w16cid="http://schemas.microsoft.com/office/word/2016/wordml/cid" xmlns:w16="http://schemas.microsoft.com/office/word/2018/wordml" xmlns:w16sdtdh="http://schemas.microsoft.com/office/word/2020/wordml/sdtdatahash" xmlns:w16se="http://schemas.microsoft.com/office/word/2015/wordml/symex" xmlns:wpg="http://schemas.microsoft.com/office/word/2010/wordprocessingGroup" xmlns:wpi="http://schemas.microsoft.com/office/word/2010/wordprocessingInk" xmlns:wne="http://schemas.microsoft.com/office/word/2006/wordml" xmlns:wps="http://schemas.microsoft.com/office/word/2010/wordprocessingShape" mc:Ignorable="w14 w15 w16se w16cid w16 w16cex w16sdtdh wp14">
+<w:footnotes xmlns:wpc="http://schemas.microsoft.com/office/word/2010/wordprocessingCanvas" xmlns:cx="http://schemas.microsoft.com/office/drawing/2014/chartex" xmlns:cx1="http://schemas.microsoft.com/office/drawing/2015/9/8/chartex" xmlns:cx2="http://schemas.microsoft.com/office/drawing/2015/10/21/chartex" xmlns:cx3="http://schemas.microsoft.com/office/drawing/2016/5/9/chartex" xmlns:cx4="http://schemas.microsoft.com/office/drawing/2016/5/10/chartex" xmlns:cx5="http://schemas.microsoft.com/office/drawing/2016/5/11/chartex" xmlns:cx6="http://schemas.microsoft.com/office/drawing/2016/5/12/chartex" xmlns:cx7="http://schemas.microsoft.com/office/drawing/2016/5/13/chartex" xmlns:cx8="http://schemas.microsoft.com/office/drawing/2016/5/14/chartex" xmlns:mc="http://schemas.openxmlformats.org/markup-compatibility/2006" xmlns:aink="http://schemas.microsoft.com/office/drawing/2016/ink" xmlns:am3d="http://schemas.microsoft.com/office/drawing/2017/model3d" xmlns:o="urn:schemas-microsoft-com:office:office" xmlns:oel="http://schemas.microsoft.com/office/2019/extlst" xmlns:r="http://schemas.openxmlformats.org/officeDocument/2006/relationships" xmlns:m="http://schemas.openxmlformats.org/officeDocument/2006/math" xmlns:v="urn:schemas-microsoft-com:vml" xmlns:wp14="http://schemas.microsoft.com/office/word/2010/wordprocessingDrawing" xmlns:wp="http://schemas.openxmlformats.org/drawingml/2006/wordprocessingDrawing" xmlns:w10="urn:schemas-microsoft-com:office:word" xmlns:w="http://schemas.openxmlformats.org/wordprocessingml/2006/main" xmlns:w14="http://schemas.microsoft.com/office/word/2010/wordml" xmlns:w15="http://schemas.microsoft.com/office/word/2012/wordml" xmlns:w16cex="http://schemas.microsoft.com/office/word/2018/wordml/cex" xmlns:w16cid="http://schemas.microsoft.com/office/word/2016/wordml/cid" xmlns:w16="http://schemas.microsoft.com/office/word/2018/wordml" xmlns:w16du="http://schemas.microsoft.com/office/word/2023/wordml/word16du" xmlns:w16sdtdh="http://schemas.microsoft.com/office/word/2020/wordml/sdtdatahash" xmlns:w16sdtfl="http://schemas.microsoft.com/office/word/2024/wordml/sdtformatlock" xmlns:w16se="http://schemas.microsoft.com/office/word/2015/wordml/symex" xmlns:wpg="http://schemas.microsoft.com/office/word/2010/wordprocessingGroup" xmlns:wpi="http://schemas.microsoft.com/office/word/2010/wordprocessingInk" xmlns:wne="http://schemas.microsoft.com/office/word/2006/wordml" xmlns:wps="http://schemas.microsoft.com/office/word/2010/wordprocessingShape" mc:Ignorable="w14 w15 w16se w16cid w16 w16cex w16sdtdh w16sdtfl w16du wp14">
   <w:footnote w:type="separator" w:id="-1">
     <w:p>
       <w:pPr>
@@ -1063,7 +962,7 @@
 </file>
 
 <file path=word/header1.xml><?xml version="1.0" encoding="utf-8"?>
-<w:hdr xmlns:wpc="http://schemas.microsoft.com/office/word/2010/wordprocessingCanvas" xmlns:cx="http://schemas.microsoft.com/office/drawing/2014/chartex" xmlns:cx1="http://schemas.microsoft.com/office/drawing/2015/9/8/chartex" xmlns:cx2="http://schemas.microsoft.com/office/drawing/2015/10/21/chartex" xmlns:cx3="http://schemas.microsoft.com/office/drawing/2016/5/9/chartex" xmlns:cx4="http://schemas.microsoft.com/office/drawing/2016/5/10/chartex" xmlns:cx5="http://schemas.microsoft.com/office/drawing/2016/5/11/chartex" xmlns:cx6="http://schemas.microsoft.com/office/drawing/2016/5/12/chartex" xmlns:cx7="http://schemas.microsoft.com/office/drawing/2016/5/13/chartex" xmlns:cx8="http://schemas.microsoft.com/office/drawing/2016/5/14/chartex" xmlns:mc="http://schemas.openxmlformats.org/markup-compatibility/2006" xmlns:aink="http://schemas.microsoft.com/office/drawing/2016/ink" xmlns:am3d="http://schemas.microsoft.com/office/drawing/2017/model3d" xmlns:o="urn:schemas-microsoft-com:office:office" xmlns:r="http://schemas.openxmlformats.org/officeDocument/2006/relationships" xmlns:m="http://schemas.openxmlformats.org/officeDocument/2006/math" xmlns:v="urn:schemas-microsoft-com:vml" xmlns:wp14="http://schemas.microsoft.com/office/word/2010/wordprocessingDrawing" xmlns:wp="http://schemas.openxmlformats.org/drawingml/2006/wordprocessingDrawing" xmlns:w10="urn:schemas-microsoft-com:office:word" xmlns:w="http://schemas.openxmlformats.org/wordprocessingml/2006/main" xmlns:w14="http://schemas.microsoft.com/office/word/2010/wordml" xmlns:w15="http://schemas.microsoft.com/office/word/2012/wordml" xmlns:w16cex="http://schemas.microsoft.com/office/word/2018/wordml/cex" xmlns:w16cid="http://schemas.microsoft.com/office/word/2016/wordml/cid" xmlns:w16="http://schemas.microsoft.com/office/word/2018/wordml" xmlns:w16sdtdh="http://schemas.microsoft.com/office/word/2020/wordml/sdtdatahash" xmlns:w16se="http://schemas.microsoft.com/office/word/2015/wordml/symex" xmlns:wpg="http://schemas.microsoft.com/office/word/2010/wordprocessingGroup" xmlns:wpi="http://schemas.microsoft.com/office/word/2010/wordprocessingInk" xmlns:wne="http://schemas.microsoft.com/office/word/2006/wordml" xmlns:wps="http://schemas.microsoft.com/office/word/2010/wordprocessingShape" mc:Ignorable="w14 w15 w16se w16cid w16 w16cex w16sdtdh wp14">
+<w:hdr xmlns:wpc="http://schemas.microsoft.com/office/word/2010/wordprocessingCanvas" xmlns:cx="http://schemas.microsoft.com/office/drawing/2014/chartex" xmlns:cx1="http://schemas.microsoft.com/office/drawing/2015/9/8/chartex" xmlns:cx2="http://schemas.microsoft.com/office/drawing/2015/10/21/chartex" xmlns:cx3="http://schemas.microsoft.com/office/drawing/2016/5/9/chartex" xmlns:cx4="http://schemas.microsoft.com/office/drawing/2016/5/10/chartex" xmlns:cx5="http://schemas.microsoft.com/office/drawing/2016/5/11/chartex" xmlns:cx6="http://schemas.microsoft.com/office/drawing/2016/5/12/chartex" xmlns:cx7="http://schemas.microsoft.com/office/drawing/2016/5/13/chartex" xmlns:cx8="http://schemas.microsoft.com/office/drawing/2016/5/14/chartex" xmlns:mc="http://schemas.openxmlformats.org/markup-compatibility/2006" xmlns:aink="http://schemas.microsoft.com/office/drawing/2016/ink" xmlns:am3d="http://schemas.microsoft.com/office/drawing/2017/model3d" xmlns:o="urn:schemas-microsoft-com:office:office" xmlns:oel="http://schemas.microsoft.com/office/2019/extlst" xmlns:r="http://schemas.openxmlformats.org/officeDocument/2006/relationships" xmlns:m="http://schemas.openxmlformats.org/officeDocument/2006/math" xmlns:v="urn:schemas-microsoft-com:vml" xmlns:wp14="http://schemas.microsoft.com/office/word/2010/wordprocessingDrawing" xmlns:wp="http://schemas.openxmlformats.org/drawingml/2006/wordprocessingDrawing" xmlns:w10="urn:schemas-microsoft-com:office:word" xmlns:w="http://schemas.openxmlformats.org/wordprocessingml/2006/main" xmlns:w14="http://schemas.microsoft.com/office/word/2010/wordml" xmlns:w15="http://schemas.microsoft.com/office/word/2012/wordml" xmlns:w16cex="http://schemas.microsoft.com/office/word/2018/wordml/cex" xmlns:w16cid="http://schemas.microsoft.com/office/word/2016/wordml/cid" xmlns:w16="http://schemas.microsoft.com/office/word/2018/wordml" xmlns:w16du="http://schemas.microsoft.com/office/word/2023/wordml/word16du" xmlns:w16sdtdh="http://schemas.microsoft.com/office/word/2020/wordml/sdtdatahash" xmlns:w16sdtfl="http://schemas.microsoft.com/office/word/2024/wordml/sdtformatlock" xmlns:w16se="http://schemas.microsoft.com/office/word/2015/wordml/symex" xmlns:wpg="http://schemas.microsoft.com/office/word/2010/wordprocessingGroup" xmlns:wpi="http://schemas.microsoft.com/office/word/2010/wordprocessingInk" xmlns:wne="http://schemas.microsoft.com/office/word/2006/wordml" xmlns:wps="http://schemas.microsoft.com/office/word/2010/wordprocessingShape" mc:Ignorable="w14 w15 w16se w16cid w16 w16cex w16sdtdh w16sdtfl w16du wp14">
   <w:p>
     <w:pPr>
       <w:pStyle w:val="a5"/>
@@ -1097,7 +996,7 @@
           </v:handles>
           <o:lock v:ext="edit" text="t" shapetype="t"/>
         </v:shapetype>
-        <v:shape id="PowerPlusWaterMarkObject104969204" o:spid="_x0000_s2054" type="#_x0000_t136" style="position:absolute;margin-left:0;margin-top:0;width:439.65pt;height:219.8pt;rotation:315;z-index:-251655168;mso-position-horizontal:center;mso-position-horizontal-relative:margin;mso-position-vertical:center;mso-position-vertical-relative:margin" o:allowincell="f" fillcolor="silver" stroked="f">
+        <v:shape id="PowerPlusWaterMarkObject104969204" o:spid="_x0000_s1026" type="#_x0000_t136" alt="" style="position:absolute;margin-left:0;margin-top:0;width:439.65pt;height:219.8pt;rotation:315;z-index:-251655168;mso-wrap-edited:f;mso-width-percent:0;mso-height-percent:0;mso-position-horizontal:center;mso-position-horizontal-relative:margin;mso-position-vertical:center;mso-position-vertical-relative:margin;mso-width-percent:0;mso-height-percent:0" o:allowincell="f" fillcolor="silver" stroked="f">
           <v:fill opacity=".5"/>
           <v:textpath style="font-family:&quot;Calibri&quot;;font-size:1pt" string="РОССИЯ"/>
           <w10:wrap anchorx="margin" anchory="margin"/>
@@ -1109,7 +1008,7 @@
 </file>
 
 <file path=word/header2.xml><?xml version="1.0" encoding="utf-8"?>
-<w:hdr xmlns:wpc="http://schemas.microsoft.com/office/word/2010/wordprocessingCanvas" xmlns:cx="http://schemas.microsoft.com/office/drawing/2014/chartex" xmlns:cx1="http://schemas.microsoft.com/office/drawing/2015/9/8/chartex" xmlns:cx2="http://schemas.microsoft.com/office/drawing/2015/10/21/chartex" xmlns:cx3="http://schemas.microsoft.com/office/drawing/2016/5/9/chartex" xmlns:cx4="http://schemas.microsoft.com/office/drawing/2016/5/10/chartex" xmlns:cx5="http://schemas.microsoft.com/office/drawing/2016/5/11/chartex" xmlns:cx6="http://schemas.microsoft.com/office/drawing/2016/5/12/chartex" xmlns:cx7="http://schemas.microsoft.com/office/drawing/2016/5/13/chartex" xmlns:cx8="http://schemas.microsoft.com/office/drawing/2016/5/14/chartex" xmlns:mc="http://schemas.openxmlformats.org/markup-compatibility/2006" xmlns:aink="http://schemas.microsoft.com/office/drawing/2016/ink" xmlns:am3d="http://schemas.microsoft.com/office/drawing/2017/model3d" xmlns:o="urn:schemas-microsoft-com:office:office" xmlns:r="http://schemas.openxmlformats.org/officeDocument/2006/relationships" xmlns:m="http://schemas.openxmlformats.org/officeDocument/2006/math" xmlns:v="urn:schemas-microsoft-com:vml" xmlns:wp14="http://schemas.microsoft.com/office/word/2010/wordprocessingDrawing" xmlns:wp="http://schemas.openxmlformats.org/drawingml/2006/wordprocessingDrawing" xmlns:w10="urn:schemas-microsoft-com:office:word" xmlns:w="http://schemas.openxmlformats.org/wordprocessingml/2006/main" xmlns:w14="http://schemas.microsoft.com/office/word/2010/wordml" xmlns:w15="http://schemas.microsoft.com/office/word/2012/wordml" xmlns:w16cex="http://schemas.microsoft.com/office/word/2018/wordml/cex" xmlns:w16cid="http://schemas.microsoft.com/office/word/2016/wordml/cid" xmlns:w16="http://schemas.microsoft.com/office/word/2018/wordml" xmlns:w16sdtdh="http://schemas.microsoft.com/office/word/2020/wordml/sdtdatahash" xmlns:w16se="http://schemas.microsoft.com/office/word/2015/wordml/symex" xmlns:wpg="http://schemas.microsoft.com/office/word/2010/wordprocessingGroup" xmlns:wpi="http://schemas.microsoft.com/office/word/2010/wordprocessingInk" xmlns:wne="http://schemas.microsoft.com/office/word/2006/wordml" xmlns:wps="http://schemas.microsoft.com/office/word/2010/wordprocessingShape" mc:Ignorable="w14 w15 w16se w16cid w16 w16cex w16sdtdh wp14">
+<w:hdr xmlns:wpc="http://schemas.microsoft.com/office/word/2010/wordprocessingCanvas" xmlns:cx="http://schemas.microsoft.com/office/drawing/2014/chartex" xmlns:cx1="http://schemas.microsoft.com/office/drawing/2015/9/8/chartex" xmlns:cx2="http://schemas.microsoft.com/office/drawing/2015/10/21/chartex" xmlns:cx3="http://schemas.microsoft.com/office/drawing/2016/5/9/chartex" xmlns:cx4="http://schemas.microsoft.com/office/drawing/2016/5/10/chartex" xmlns:cx5="http://schemas.microsoft.com/office/drawing/2016/5/11/chartex" xmlns:cx6="http://schemas.microsoft.com/office/drawing/2016/5/12/chartex" xmlns:cx7="http://schemas.microsoft.com/office/drawing/2016/5/13/chartex" xmlns:cx8="http://schemas.microsoft.com/office/drawing/2016/5/14/chartex" xmlns:mc="http://schemas.openxmlformats.org/markup-compatibility/2006" xmlns:aink="http://schemas.microsoft.com/office/drawing/2016/ink" xmlns:am3d="http://schemas.microsoft.com/office/drawing/2017/model3d" xmlns:o="urn:schemas-microsoft-com:office:office" xmlns:oel="http://schemas.microsoft.com/office/2019/extlst" xmlns:r="http://schemas.openxmlformats.org/officeDocument/2006/relationships" xmlns:m="http://schemas.openxmlformats.org/officeDocument/2006/math" xmlns:v="urn:schemas-microsoft-com:vml" xmlns:wp14="http://schemas.microsoft.com/office/word/2010/wordprocessingDrawing" xmlns:wp="http://schemas.openxmlformats.org/drawingml/2006/wordprocessingDrawing" xmlns:w10="urn:schemas-microsoft-com:office:word" xmlns:w="http://schemas.openxmlformats.org/wordprocessingml/2006/main" xmlns:w14="http://schemas.microsoft.com/office/word/2010/wordml" xmlns:w15="http://schemas.microsoft.com/office/word/2012/wordml" xmlns:w16cex="http://schemas.microsoft.com/office/word/2018/wordml/cex" xmlns:w16cid="http://schemas.microsoft.com/office/word/2016/wordml/cid" xmlns:w16="http://schemas.microsoft.com/office/word/2018/wordml" xmlns:w16du="http://schemas.microsoft.com/office/word/2023/wordml/word16du" xmlns:w16sdtdh="http://schemas.microsoft.com/office/word/2020/wordml/sdtdatahash" xmlns:w16sdtfl="http://schemas.microsoft.com/office/word/2024/wordml/sdtformatlock" xmlns:w16se="http://schemas.microsoft.com/office/word/2015/wordml/symex" xmlns:wpg="http://schemas.microsoft.com/office/word/2010/wordprocessingGroup" xmlns:wpi="http://schemas.microsoft.com/office/word/2010/wordprocessingInk" xmlns:wne="http://schemas.microsoft.com/office/word/2006/wordml" xmlns:wps="http://schemas.microsoft.com/office/word/2010/wordprocessingShape" mc:Ignorable="w14 w15 w16se w16cid w16 w16cex w16sdtdh w16sdtfl w16du wp14">
   <w:p>
     <w:pPr>
       <w:pStyle w:val="a5"/>
@@ -1143,7 +1042,7 @@
           </v:handles>
           <o:lock v:ext="edit" text="t" shapetype="t"/>
         </v:shapetype>
-        <v:shape id="PowerPlusWaterMarkObject104969203" o:spid="_x0000_s2053" type="#_x0000_t136" style="position:absolute;margin-left:0;margin-top:0;width:439.65pt;height:219.8pt;rotation:315;z-index:-251657216;mso-position-horizontal:center;mso-position-horizontal-relative:margin;mso-position-vertical:center;mso-position-vertical-relative:margin" o:allowincell="f" fillcolor="silver" stroked="f">
+        <v:shape id="PowerPlusWaterMarkObject104969203" o:spid="_x0000_s1025" type="#_x0000_t136" alt="" style="position:absolute;margin-left:0;margin-top:0;width:439.65pt;height:219.8pt;rotation:315;z-index:-251657216;mso-wrap-edited:f;mso-width-percent:0;mso-height-percent:0;mso-position-horizontal:center;mso-position-horizontal-relative:margin;mso-position-vertical:center;mso-position-vertical-relative:margin;mso-width-percent:0;mso-height-percent:0" o:allowincell="f" fillcolor="silver" stroked="f">
           <v:fill opacity=".5"/>
           <v:textpath style="font-family:&quot;Calibri&quot;;font-size:1pt" string="РОССИЯ"/>
           <w10:wrap anchorx="margin" anchory="margin"/>
@@ -1155,7 +1054,7 @@
 </file>
 
 <file path=word/numbering.xml><?xml version="1.0" encoding="utf-8"?>
-<w:numbering xmlns:wpc="http://schemas.microsoft.com/office/word/2010/wordprocessingCanvas" xmlns:cx="http://schemas.microsoft.com/office/drawing/2014/chartex" xmlns:cx1="http://schemas.microsoft.com/office/drawing/2015/9/8/chartex" xmlns:cx2="http://schemas.microsoft.com/office/drawing/2015/10/21/chartex" xmlns:cx3="http://schemas.microsoft.com/office/drawing/2016/5/9/chartex" xmlns:cx4="http://schemas.microsoft.com/office/drawing/2016/5/10/chartex" xmlns:cx5="http://schemas.microsoft.com/office/drawing/2016/5/11/chartex" xmlns:cx6="http://schemas.microsoft.com/office/drawing/2016/5/12/chartex" xmlns:cx7="http://schemas.microsoft.com/office/drawing/2016/5/13/chartex" xmlns:cx8="http://schemas.microsoft.com/office/drawing/2016/5/14/chartex" xmlns:mc="http://schemas.openxmlformats.org/markup-compatibility/2006" xmlns:aink="http://schemas.microsoft.com/office/drawing/2016/ink" xmlns:am3d="http://schemas.microsoft.com/office/drawing/2017/model3d" xmlns:o="urn:schemas-microsoft-com:office:office" xmlns:r="http://schemas.openxmlformats.org/officeDocument/2006/relationships" xmlns:m="http://schemas.openxmlformats.org/officeDocument/2006/math" xmlns:v="urn:schemas-microsoft-com:vml" xmlns:wp14="http://schemas.microsoft.com/office/word/2010/wordprocessingDrawing" xmlns:wp="http://schemas.openxmlformats.org/drawingml/2006/wordprocessingDrawing" xmlns:w10="urn:schemas-microsoft-com:office:word" xmlns:w="http://schemas.openxmlformats.org/wordprocessingml/2006/main" xmlns:w14="http://schemas.microsoft.com/office/word/2010/wordml" xmlns:w15="http://schemas.microsoft.com/office/word/2012/wordml" xmlns:w16cex="http://schemas.microsoft.com/office/word/2018/wordml/cex" xmlns:w16cid="http://schemas.microsoft.com/office/word/2016/wordml/cid" xmlns:w16="http://schemas.microsoft.com/office/word/2018/wordml" xmlns:w16sdtdh="http://schemas.microsoft.com/office/word/2020/wordml/sdtdatahash" xmlns:w16se="http://schemas.microsoft.com/office/word/2015/wordml/symex" xmlns:wpg="http://schemas.microsoft.com/office/word/2010/wordprocessingGroup" xmlns:wpi="http://schemas.microsoft.com/office/word/2010/wordprocessingInk" xmlns:wne="http://schemas.microsoft.com/office/word/2006/wordml" xmlns:wps="http://schemas.microsoft.com/office/word/2010/wordprocessingShape" mc:Ignorable="w14 w15 w16se w16cid w16 w16cex w16sdtdh wp14">
+<w:numbering xmlns:wpc="http://schemas.microsoft.com/office/word/2010/wordprocessingCanvas" xmlns:cx="http://schemas.microsoft.com/office/drawing/2014/chartex" xmlns:cx1="http://schemas.microsoft.com/office/drawing/2015/9/8/chartex" xmlns:cx2="http://schemas.microsoft.com/office/drawing/2015/10/21/chartex" xmlns:cx3="http://schemas.microsoft.com/office/drawing/2016/5/9/chartex" xmlns:cx4="http://schemas.microsoft.com/office/drawing/2016/5/10/chartex" xmlns:cx5="http://schemas.microsoft.com/office/drawing/2016/5/11/chartex" xmlns:cx6="http://schemas.microsoft.com/office/drawing/2016/5/12/chartex" xmlns:cx7="http://schemas.microsoft.com/office/drawing/2016/5/13/chartex" xmlns:cx8="http://schemas.microsoft.com/office/drawing/2016/5/14/chartex" xmlns:mc="http://schemas.openxmlformats.org/markup-compatibility/2006" xmlns:aink="http://schemas.microsoft.com/office/drawing/2016/ink" xmlns:am3d="http://schemas.microsoft.com/office/drawing/2017/model3d" xmlns:o="urn:schemas-microsoft-com:office:office" xmlns:oel="http://schemas.microsoft.com/office/2019/extlst" xmlns:r="http://schemas.openxmlformats.org/officeDocument/2006/relationships" xmlns:m="http://schemas.openxmlformats.org/officeDocument/2006/math" xmlns:v="urn:schemas-microsoft-com:vml" xmlns:wp14="http://schemas.microsoft.com/office/word/2010/wordprocessingDrawing" xmlns:wp="http://schemas.openxmlformats.org/drawingml/2006/wordprocessingDrawing" xmlns:w10="urn:schemas-microsoft-com:office:word" xmlns:w="http://schemas.openxmlformats.org/wordprocessingml/2006/main" xmlns:w14="http://schemas.microsoft.com/office/word/2010/wordml" xmlns:w15="http://schemas.microsoft.com/office/word/2012/wordml" xmlns:w16cex="http://schemas.microsoft.com/office/word/2018/wordml/cex" xmlns:w16cid="http://schemas.microsoft.com/office/word/2016/wordml/cid" xmlns:w16="http://schemas.microsoft.com/office/word/2018/wordml" xmlns:w16du="http://schemas.microsoft.com/office/word/2023/wordml/word16du" xmlns:w16sdtdh="http://schemas.microsoft.com/office/word/2020/wordml/sdtdatahash" xmlns:w16sdtfl="http://schemas.microsoft.com/office/word/2024/wordml/sdtformatlock" xmlns:w16se="http://schemas.microsoft.com/office/word/2015/wordml/symex" xmlns:wpg="http://schemas.microsoft.com/office/word/2010/wordprocessingGroup" xmlns:wpi="http://schemas.microsoft.com/office/word/2010/wordprocessingInk" xmlns:wne="http://schemas.microsoft.com/office/word/2006/wordml" xmlns:wps="http://schemas.microsoft.com/office/word/2010/wordprocessingShape" mc:Ignorable="w14 w15 w16se w16cid w16 w16cex w16sdtdh w16sdtfl w16du wp14">
   <w:abstractNum w:abstractNumId="0" w15:restartNumberingAfterBreak="0">
     <w:nsid w:val="031F7BB3"/>
     <w:multiLevelType w:val="hybridMultilevel"/>
@@ -1423,20 +1322,20 @@
       </w:pPr>
     </w:lvl>
   </w:abstractNum>
-  <w:num w:numId="1">
+  <w:num w:numId="1" w16cid:durableId="1685671992">
     <w:abstractNumId w:val="1"/>
   </w:num>
-  <w:num w:numId="2">
+  <w:num w:numId="2" w16cid:durableId="435255093">
     <w:abstractNumId w:val="0"/>
   </w:num>
-  <w:num w:numId="3">
+  <w:num w:numId="3" w16cid:durableId="71706991">
     <w:abstractNumId w:val="2"/>
   </w:num>
 </w:numbering>
 </file>
 
 <file path=word/styles.xml><?xml version="1.0" encoding="utf-8"?>
-<w:styles xmlns:mc="http://schemas.openxmlformats.org/markup-compatibility/2006" xmlns:r="http://schemas.openxmlformats.org/officeDocument/2006/relationships" xmlns:w="http://schemas.openxmlformats.org/wordprocessingml/2006/main" xmlns:w14="http://schemas.microsoft.com/office/word/2010/wordml" xmlns:w15="http://schemas.microsoft.com/office/word/2012/wordml" xmlns:w16cex="http://schemas.microsoft.com/office/word/2018/wordml/cex" xmlns:w16cid="http://schemas.microsoft.com/office/word/2016/wordml/cid" xmlns:w16="http://schemas.microsoft.com/office/word/2018/wordml" xmlns:w16sdtdh="http://schemas.microsoft.com/office/word/2020/wordml/sdtdatahash" xmlns:w16se="http://schemas.microsoft.com/office/word/2015/wordml/symex" mc:Ignorable="w14 w15 w16se w16cid w16 w16cex w16sdtdh">
+<w:styles xmlns:mc="http://schemas.openxmlformats.org/markup-compatibility/2006" xmlns:r="http://schemas.openxmlformats.org/officeDocument/2006/relationships" xmlns:w="http://schemas.openxmlformats.org/wordprocessingml/2006/main" xmlns:w14="http://schemas.microsoft.com/office/word/2010/wordml" xmlns:w15="http://schemas.microsoft.com/office/word/2012/wordml" xmlns:w16cex="http://schemas.microsoft.com/office/word/2018/wordml/cex" xmlns:w16cid="http://schemas.microsoft.com/office/word/2016/wordml/cid" xmlns:w16="http://schemas.microsoft.com/office/word/2018/wordml" xmlns:w16du="http://schemas.microsoft.com/office/word/2023/wordml/word16du" xmlns:w16sdtdh="http://schemas.microsoft.com/office/word/2020/wordml/sdtdatahash" xmlns:w16sdtfl="http://schemas.microsoft.com/office/word/2024/wordml/sdtformatlock" xmlns:w16se="http://schemas.microsoft.com/office/word/2015/wordml/symex" mc:Ignorable="w14 w15 w16se w16cid w16 w16cex w16sdtdh w16sdtfl w16du">
   <w:docDefaults>
     <w:rPrDefault>
       <w:rPr>

</xml_diff>